<commit_message>
Tutorial Firebase: tambah petunjuk untuk situs Vercel
Co-Authored-By: Claude Opus 5.5 <noreply@anthropic.com>
Claude-Session: https://claude.ai/code/session_0129ryr42iuGGCdByrSF5R7U
</commit_message>
<xml_diff>
--- a/docs/Tutorial_Login_Firebase_GeoMatch.docx
+++ b/docs/Tutorial_Login_Firebase_GeoMatch.docx
@@ -412,7 +412,7 @@
                 <w:sz w:val="19"/>
                 <w:szCs w:val="19"/>
               </w:rPr>
-              <w:t xml:space="preserve">Akun Google, akses ke repositori GitHub GeoMatch, situs Netlify (opsional tetapi disarankan)</w:t>
+              <w:t xml:space="preserve">Akun Google, akses ke repositori GitHub GeoMatch, situs yang sudah online (Netlify atau Vercel)</w:t>
             </w:r>
           </w:p>
         </w:tc>
@@ -3944,7 +3944,35 @@
         <w:rPr>
           <w:rFonts w:ascii="Calibri" w:cs="Calibri" w:eastAsia="Calibri" w:hAnsi="Calibri"/>
         </w:rPr>
-        <w:t xml:space="preserve">). Jika situs Netlify terhubung ke repositori, Netlify akan memperbarui situs otomatis dalam 1-2 menit.</w:t>
+        <w:t xml:space="preserve">). Jika situs Netlify atau Vercel terhubung ke repositori, situs akan diperbarui otomatis dalam 1-2 menit. Di Vercel, pantau di menu </w:t>
+      </w:r>
+      <w:r>
+        <w:rPr>
+          <w:rFonts w:ascii="Calibri" w:cs="Calibri" w:eastAsia="Calibri" w:hAnsi="Calibri"/>
+          <w:b/>
+          <w:bCs/>
+        </w:rPr>
+        <w:t xml:space="preserve">Deployments</w:t>
+      </w:r>
+      <w:r>
+        <w:rPr>
+          <w:rFonts w:ascii="Calibri" w:cs="Calibri" w:eastAsia="Calibri" w:hAnsi="Calibri"/>
+        </w:rPr>
+        <w:t xml:space="preserve"> sampai status deployment terbaru </w:t>
+      </w:r>
+      <w:r>
+        <w:rPr>
+          <w:rFonts w:ascii="Calibri" w:cs="Calibri" w:eastAsia="Calibri" w:hAnsi="Calibri"/>
+          <w:b/>
+          <w:bCs/>
+        </w:rPr>
+        <w:t xml:space="preserve">Ready</w:t>
+      </w:r>
+      <w:r>
+        <w:rPr>
+          <w:rFonts w:ascii="Calibri" w:cs="Calibri" w:eastAsia="Calibri" w:hAnsi="Calibri"/>
+        </w:rPr>
+        <w:t xml:space="preserve">.</w:t>
       </w:r>
     </w:p>
     <w:p>
@@ -4012,7 +4040,7 @@
           <w:sz w:val="30"/>
           <w:szCs w:val="30"/>
         </w:rPr>
-        <w:t xml:space="preserve">8. Mendaftarkan Domain Netlify di Firebase</w:t>
+        <w:t xml:space="preserve">8. Mendaftarkan Domain Website di Firebase</w:t>
       </w:r>
     </w:p>
     <w:p>
@@ -4112,7 +4140,7 @@
         <w:rPr>
           <w:rFonts w:ascii="Calibri" w:cs="Calibri" w:eastAsia="Calibri" w:hAnsi="Calibri"/>
         </w:rPr>
-        <w:t xml:space="preserve">3. Masukkan domain Netlify tanpa </w:t>
+        <w:t xml:space="preserve">3. Masukkan domain website saja, tanpa </w:t>
       </w:r>
       <w:r>
         <w:rPr>
@@ -4128,7 +4156,7 @@
         <w:rPr>
           <w:rFonts w:ascii="Calibri" w:cs="Calibri" w:eastAsia="Calibri" w:hAnsi="Calibri"/>
         </w:rPr>
-        <w:t xml:space="preserve">, misalnya </w:t>
+        <w:t xml:space="preserve"> dan tanpa bagian </w:t>
       </w:r>
       <w:r>
         <w:rPr>
@@ -4138,38 +4166,13 @@
           <w:sz w:val="20"/>
           <w:szCs w:val="20"/>
         </w:rPr>
-        <w:t xml:space="preserve">geomatch-smpn1.netlify.app</w:t>
-      </w:r>
-      <w:r>
-        <w:rPr>
-          <w:rFonts w:ascii="Calibri" w:cs="Calibri" w:eastAsia="Calibri" w:hAnsi="Calibri"/>
-        </w:rPr>
-        <w:t xml:space="preserve">. Jika memakai domain sendiri, tambahkan juga domain tersebut.</w:t>
-      </w:r>
-    </w:p>
-    <w:p>
-      <w:pPr>
-        <w:spacing w:after="120"/>
-      </w:pPr>
-      <w:r>
-        <w:rPr>
-          <w:rFonts w:ascii="Calibri" w:cs="Calibri" w:eastAsia="Calibri" w:hAnsi="Calibri"/>
-        </w:rPr>
-        <w:t xml:space="preserve">4. Klik </w:t>
-      </w:r>
-      <w:r>
-        <w:rPr>
-          <w:rFonts w:ascii="Calibri" w:cs="Calibri" w:eastAsia="Calibri" w:hAnsi="Calibri"/>
-          <w:b/>
-          <w:bCs/>
-        </w:rPr>
-        <w:t xml:space="preserve">Add</w:t>
-      </w:r>
-      <w:r>
-        <w:rPr>
-          <w:rFonts w:ascii="Calibri" w:cs="Calibri" w:eastAsia="Calibri" w:hAnsi="Calibri"/>
-        </w:rPr>
-        <w:t xml:space="preserve">. Domain </w:t>
+        <w:t xml:space="preserve">/#/...</w:t>
+      </w:r>
+      <w:r>
+        <w:rPr>
+          <w:rFonts w:ascii="Calibri" w:cs="Calibri" w:eastAsia="Calibri" w:hAnsi="Calibri"/>
+        </w:rPr>
+        <w:t xml:space="preserve">. Contoh Netlify: </w:t>
       </w:r>
       <w:r>
         <w:rPr>
@@ -4179,176 +4182,13 @@
           <w:sz w:val="20"/>
           <w:szCs w:val="20"/>
         </w:rPr>
-        <w:t xml:space="preserve">localhost</w:t>
-      </w:r>
-      <w:r>
-        <w:rPr>
-          <w:rFonts w:ascii="Calibri" w:cs="Calibri" w:eastAsia="Calibri" w:hAnsi="Calibri"/>
-        </w:rPr>
-        <w:t xml:space="preserve"> biasanya sudah ada secara bawaan untuk uji coba di komputer.</w:t>
-      </w:r>
-    </w:p>
-    <w:p>
-      <w:pPr>
-        <w:spacing w:after="120"/>
-      </w:pPr>
-      <w:r>
-        <w:rPr>
-          <w:rFonts w:ascii="Calibri" w:cs="Calibri" w:eastAsia="Calibri" w:hAnsi="Calibri"/>
-        </w:rPr>
-        <w:t xml:space="preserve">Jika langkah ini terlewat, siswa akan melihat pesan: "Domain website ini belum didaftarkan di Firebase".</w:t>
-      </w:r>
-    </w:p>
-    <w:p>
-      <w:pPr>
-        <w:pBdr>
-          <w:bottom w:val="single" w:color="CBD5E1" w:sz="6" w:space="1"/>
-        </w:pBdr>
-        <w:spacing w:after="120"/>
-      </w:pPr>
-    </w:p>
-    <w:p>
-      <w:pPr>
-        <w:pStyle w:val="Heading1"/>
-        <w:spacing w:after="140" w:before="320"/>
-      </w:pPr>
-      <w:r>
-        <w:rPr>
-          <w:rFonts w:ascii="Calibri" w:cs="Calibri" w:eastAsia="Calibri" w:hAnsi="Calibri"/>
-          <w:b/>
-          <w:bCs/>
-          <w:color w:val="17324D"/>
-          <w:sz w:val="30"/>
-          <w:szCs w:val="30"/>
-        </w:rPr>
-        <w:t xml:space="preserve">9. Membuat Akun Guru</w:t>
-      </w:r>
-    </w:p>
-    <w:p>
-      <w:pPr>
-        <w:spacing w:after="120"/>
-      </w:pPr>
-      <w:r>
-        <w:rPr>
-          <w:rFonts w:ascii="Calibri" w:cs="Calibri" w:eastAsia="Calibri" w:hAnsi="Calibri"/>
-        </w:rPr>
-        <w:t xml:space="preserve">Akun guru dibuat oleh admin (pemilik proyek Firebase), bukan dari website.</w:t>
-      </w:r>
-    </w:p>
-    <w:p>
-      <w:pPr>
-        <w:spacing w:after="120"/>
-      </w:pPr>
-      <w:r>
-        <w:rPr>
-          <w:rFonts w:ascii="Calibri" w:cs="Calibri" w:eastAsia="Calibri" w:hAnsi="Calibri"/>
-          <w:b/>
-          <w:bCs/>
-        </w:rPr>
-        <w:t xml:space="preserve">Langkah A: buat akun login guru</w:t>
-      </w:r>
-    </w:p>
-    <w:p>
-      <w:pPr>
-        <w:spacing w:after="120"/>
-      </w:pPr>
-      <w:r>
-        <w:rPr>
-          <w:rFonts w:ascii="Calibri" w:cs="Calibri" w:eastAsia="Calibri" w:hAnsi="Calibri"/>
-        </w:rPr>
-        <w:t xml:space="preserve">1. Buka </w:t>
-      </w:r>
-      <w:r>
-        <w:rPr>
-          <w:rFonts w:ascii="Calibri" w:cs="Calibri" w:eastAsia="Calibri" w:hAnsi="Calibri"/>
-          <w:b/>
-          <w:bCs/>
-        </w:rPr>
-        <w:t xml:space="preserve">Authentication</w:t>
-      </w:r>
-      <w:r>
-        <w:rPr>
-          <w:rFonts w:ascii="Calibri" w:cs="Calibri" w:eastAsia="Calibri" w:hAnsi="Calibri"/>
-        </w:rPr>
-        <w:t xml:space="preserve"> &gt; tab </w:t>
-      </w:r>
-      <w:r>
-        <w:rPr>
-          <w:rFonts w:ascii="Calibri" w:cs="Calibri" w:eastAsia="Calibri" w:hAnsi="Calibri"/>
-          <w:b/>
-          <w:bCs/>
-        </w:rPr>
-        <w:t xml:space="preserve">Users</w:t>
-      </w:r>
-      <w:r>
-        <w:rPr>
-          <w:rFonts w:ascii="Calibri" w:cs="Calibri" w:eastAsia="Calibri" w:hAnsi="Calibri"/>
-        </w:rPr>
-        <w:t xml:space="preserve"> &gt; </w:t>
-      </w:r>
-      <w:r>
-        <w:rPr>
-          <w:rFonts w:ascii="Calibri" w:cs="Calibri" w:eastAsia="Calibri" w:hAnsi="Calibri"/>
-          <w:b/>
-          <w:bCs/>
-        </w:rPr>
-        <w:t xml:space="preserve">Add user</w:t>
-      </w:r>
-      <w:r>
-        <w:rPr>
-          <w:rFonts w:ascii="Calibri" w:cs="Calibri" w:eastAsia="Calibri" w:hAnsi="Calibri"/>
-        </w:rPr>
-        <w:t xml:space="preserve">.</w:t>
-      </w:r>
-    </w:p>
-    <w:p>
-      <w:pPr>
-        <w:spacing w:after="120"/>
-      </w:pPr>
-      <w:r>
-        <w:rPr>
-          <w:rFonts w:ascii="Calibri" w:cs="Calibri" w:eastAsia="Calibri" w:hAnsi="Calibri"/>
-        </w:rPr>
-        <w:t xml:space="preserve">2. Isi email guru dan kata sandi awal (minimal 6 karakter), lalu klik </w:t>
-      </w:r>
-      <w:r>
-        <w:rPr>
-          <w:rFonts w:ascii="Calibri" w:cs="Calibri" w:eastAsia="Calibri" w:hAnsi="Calibri"/>
-          <w:b/>
-          <w:bCs/>
-        </w:rPr>
-        <w:t xml:space="preserve">Add user</w:t>
-      </w:r>
-      <w:r>
-        <w:rPr>
-          <w:rFonts w:ascii="Calibri" w:cs="Calibri" w:eastAsia="Calibri" w:hAnsi="Calibri"/>
-        </w:rPr>
-        <w:t xml:space="preserve">.</w:t>
-      </w:r>
-    </w:p>
-    <w:p>
-      <w:pPr>
-        <w:spacing w:after="120"/>
-      </w:pPr>
-      <w:r>
-        <w:rPr>
-          <w:rFonts w:ascii="Calibri" w:cs="Calibri" w:eastAsia="Calibri" w:hAnsi="Calibri"/>
-        </w:rPr>
-        <w:t xml:space="preserve">3. Pada daftar pengguna, salin nilai kolom </w:t>
-      </w:r>
-      <w:r>
-        <w:rPr>
-          <w:rFonts w:ascii="Calibri" w:cs="Calibri" w:eastAsia="Calibri" w:hAnsi="Calibri"/>
-          <w:b/>
-          <w:bCs/>
-        </w:rPr>
-        <w:t xml:space="preserve">User UID</w:t>
-      </w:r>
-      <w:r>
-        <w:rPr>
-          <w:rFonts w:ascii="Calibri" w:cs="Calibri" w:eastAsia="Calibri" w:hAnsi="Calibri"/>
-        </w:rPr>
-        <w:t xml:space="preserve"> milik guru tersebut (deretan huruf dan angka, misalnya </w:t>
+        <w:t xml:space="preserve">geomatch-smpn1.netlify.app</w:t>
+      </w:r>
+      <w:r>
+        <w:rPr>
+          <w:rFonts w:ascii="Calibri" w:cs="Calibri" w:eastAsia="Calibri" w:hAnsi="Calibri"/>
+        </w:rPr>
+        <w:t xml:space="preserve">. Contoh Vercel: untuk alamat </w:t>
       </w:r>
       <w:r>
         <w:rPr>
@@ -4358,115 +4198,13 @@
           <w:sz w:val="20"/>
           <w:szCs w:val="20"/>
         </w:rPr>
-        <w:t xml:space="preserve">PqFDxXkyi4U0TUQhJOEMr99DCPZE</w:t>
-      </w:r>
-      <w:r>
-        <w:rPr>
-          <w:rFonts w:ascii="Calibri" w:cs="Calibri" w:eastAsia="Calibri" w:hAnsi="Calibri"/>
-        </w:rPr>
-        <w:t xml:space="preserve">).</w:t>
-      </w:r>
-    </w:p>
-    <w:p>
-      <w:pPr>
-        <w:spacing w:after="120"/>
-      </w:pPr>
-      <w:r>
-        <w:rPr>
-          <w:rFonts w:ascii="Calibri" w:cs="Calibri" w:eastAsia="Calibri" w:hAnsi="Calibri"/>
-          <w:b/>
-          <w:bCs/>
-        </w:rPr>
-        <w:t xml:space="preserve">Langkah B: tandai akun sebagai guru</w:t>
-      </w:r>
-    </w:p>
-    <w:p>
-      <w:pPr>
-        <w:spacing w:after="120"/>
-      </w:pPr>
-      <w:r>
-        <w:rPr>
-          <w:rFonts w:ascii="Calibri" w:cs="Calibri" w:eastAsia="Calibri" w:hAnsi="Calibri"/>
-        </w:rPr>
-        <w:t xml:space="preserve">1. Buka </w:t>
-      </w:r>
-      <w:r>
-        <w:rPr>
-          <w:rFonts w:ascii="Calibri" w:cs="Calibri" w:eastAsia="Calibri" w:hAnsi="Calibri"/>
-          <w:b/>
-          <w:bCs/>
-        </w:rPr>
-        <w:t xml:space="preserve">Firestore Database</w:t>
-      </w:r>
-      <w:r>
-        <w:rPr>
-          <w:rFonts w:ascii="Calibri" w:cs="Calibri" w:eastAsia="Calibri" w:hAnsi="Calibri"/>
-        </w:rPr>
-        <w:t xml:space="preserve"> &gt; tab </w:t>
-      </w:r>
-      <w:r>
-        <w:rPr>
-          <w:rFonts w:ascii="Calibri" w:cs="Calibri" w:eastAsia="Calibri" w:hAnsi="Calibri"/>
-          <w:b/>
-          <w:bCs/>
-        </w:rPr>
-        <w:t xml:space="preserve">Data</w:t>
-      </w:r>
-      <w:r>
-        <w:rPr>
-          <w:rFonts w:ascii="Calibri" w:cs="Calibri" w:eastAsia="Calibri" w:hAnsi="Calibri"/>
-        </w:rPr>
-        <w:t xml:space="preserve">.</w:t>
-      </w:r>
-    </w:p>
-    <w:p>
-      <w:pPr>
-        <w:spacing w:after="120"/>
-      </w:pPr>
-      <w:r>
-        <w:rPr>
-          <w:rFonts w:ascii="Calibri" w:cs="Calibri" w:eastAsia="Calibri" w:hAnsi="Calibri"/>
-        </w:rPr>
-        <w:t xml:space="preserve">2. Klik </w:t>
-      </w:r>
-      <w:r>
-        <w:rPr>
-          <w:rFonts w:ascii="Calibri" w:cs="Calibri" w:eastAsia="Calibri" w:hAnsi="Calibri"/>
-          <w:b/>
-          <w:bCs/>
-        </w:rPr>
-        <w:t xml:space="preserve">Start collection</w:t>
-      </w:r>
-      <w:r>
-        <w:rPr>
-          <w:rFonts w:ascii="Calibri" w:cs="Calibri" w:eastAsia="Calibri" w:hAnsi="Calibri"/>
-        </w:rPr>
-        <w:t xml:space="preserve"> (atau </w:t>
-      </w:r>
-      <w:r>
-        <w:rPr>
-          <w:rFonts w:ascii="Calibri" w:cs="Calibri" w:eastAsia="Calibri" w:hAnsi="Calibri"/>
-          <w:b/>
-          <w:bCs/>
-        </w:rPr>
-        <w:t xml:space="preserve">+ Start collection</w:t>
-      </w:r>
-      <w:r>
-        <w:rPr>
-          <w:rFonts w:ascii="Calibri" w:cs="Calibri" w:eastAsia="Calibri" w:hAnsi="Calibri"/>
-        </w:rPr>
-        <w:t xml:space="preserve">).</w:t>
-      </w:r>
-    </w:p>
-    <w:p>
-      <w:pPr>
-        <w:spacing w:after="120"/>
-      </w:pPr>
-      <w:r>
-        <w:rPr>
-          <w:rFonts w:ascii="Calibri" w:cs="Calibri" w:eastAsia="Calibri" w:hAnsi="Calibri"/>
-        </w:rPr>
-        <w:t xml:space="preserve">3. Collection ID: ketik </w:t>
+        <w:t xml:space="preserve">https://kongruen-omega.vercel.app/#/beranda</w:t>
+      </w:r>
+      <w:r>
+        <w:rPr>
+          <w:rFonts w:ascii="Calibri" w:cs="Calibri" w:eastAsia="Calibri" w:hAnsi="Calibri"/>
+        </w:rPr>
+        <w:t xml:space="preserve">, isi </w:t>
       </w:r>
       <w:r>
         <w:rPr>
@@ -4476,77 +4214,24 @@
           <w:sz w:val="20"/>
           <w:szCs w:val="20"/>
         </w:rPr>
-        <w:t xml:space="preserve">teachers</w:t>
-      </w:r>
-      <w:r>
-        <w:rPr>
-          <w:rFonts w:ascii="Calibri" w:cs="Calibri" w:eastAsia="Calibri" w:hAnsi="Calibri"/>
-        </w:rPr>
-        <w:t xml:space="preserve"> (huruf kecil semua, persis seperti ini). Klik </w:t>
-      </w:r>
-      <w:r>
-        <w:rPr>
-          <w:rFonts w:ascii="Calibri" w:cs="Calibri" w:eastAsia="Calibri" w:hAnsi="Calibri"/>
-          <w:b/>
-          <w:bCs/>
-        </w:rPr>
-        <w:t xml:space="preserve">Next</w:t>
-      </w:r>
-      <w:r>
-        <w:rPr>
-          <w:rFonts w:ascii="Calibri" w:cs="Calibri" w:eastAsia="Calibri" w:hAnsi="Calibri"/>
-        </w:rPr>
-        <w:t xml:space="preserve">.</w:t>
-      </w:r>
-    </w:p>
-    <w:p>
-      <w:pPr>
-        <w:spacing w:after="120"/>
-      </w:pPr>
-      <w:r>
-        <w:rPr>
-          <w:rFonts w:ascii="Calibri" w:cs="Calibri" w:eastAsia="Calibri" w:hAnsi="Calibri"/>
-        </w:rPr>
-        <w:t xml:space="preserve">4. Document ID: tempel </w:t>
-      </w:r>
-      <w:r>
-        <w:rPr>
-          <w:rFonts w:ascii="Calibri" w:cs="Calibri" w:eastAsia="Calibri" w:hAnsi="Calibri"/>
-          <w:b/>
-          <w:bCs/>
-        </w:rPr>
-        <w:t xml:space="preserve">User UID</w:t>
-      </w:r>
-      <w:r>
-        <w:rPr>
-          <w:rFonts w:ascii="Calibri" w:cs="Calibri" w:eastAsia="Calibri" w:hAnsi="Calibri"/>
-        </w:rPr>
-        <w:t xml:space="preserve"> guru dari Langkah A. Jangan klik </w:t>
-      </w:r>
-      <w:r>
-        <w:rPr>
-          <w:rFonts w:ascii="Calibri" w:cs="Calibri" w:eastAsia="Calibri" w:hAnsi="Calibri"/>
-          <w:b/>
-          <w:bCs/>
-        </w:rPr>
-        <w:t xml:space="preserve">Auto-ID</w:t>
-      </w:r>
-      <w:r>
-        <w:rPr>
-          <w:rFonts w:ascii="Calibri" w:cs="Calibri" w:eastAsia="Calibri" w:hAnsi="Calibri"/>
-        </w:rPr>
-        <w:t xml:space="preserve">.</w:t>
-      </w:r>
-    </w:p>
-    <w:p>
-      <w:pPr>
-        <w:spacing w:after="120"/>
-      </w:pPr>
-      <w:r>
-        <w:rPr>
-          <w:rFonts w:ascii="Calibri" w:cs="Calibri" w:eastAsia="Calibri" w:hAnsi="Calibri"/>
-        </w:rPr>
-        <w:t xml:space="preserve">5. Tambahkan field: Field = </w:t>
+        <w:t xml:space="preserve">kongruen-omega.vercel.app</w:t>
+      </w:r>
+      <w:r>
+        <w:rPr>
+          <w:rFonts w:ascii="Calibri" w:cs="Calibri" w:eastAsia="Calibri" w:hAnsi="Calibri"/>
+        </w:rPr>
+        <w:t xml:space="preserve">. Jika memakai domain sendiri, tambahkan juga domain tersebut.</w:t>
+      </w:r>
+    </w:p>
+    <w:p>
+      <w:pPr>
+        <w:spacing w:after="120"/>
+      </w:pPr>
+      <w:r>
+        <w:rPr>
+          <w:rFonts w:ascii="Calibri" w:cs="Calibri" w:eastAsia="Calibri" w:hAnsi="Calibri"/>
+        </w:rPr>
+        <w:t xml:space="preserve">5. Khusus Vercel: setiap deployment juga punya alamat pratinjau yang berbeda (berakhiran </w:t>
       </w:r>
       <w:r>
         <w:rPr>
@@ -4556,13 +4241,13 @@
           <w:sz w:val="20"/>
           <w:szCs w:val="20"/>
         </w:rPr>
-        <w:t xml:space="preserve">name</w:t>
-      </w:r>
-      <w:r>
-        <w:rPr>
-          <w:rFonts w:ascii="Calibri" w:cs="Calibri" w:eastAsia="Calibri" w:hAnsi="Calibri"/>
-        </w:rPr>
-        <w:t xml:space="preserve">, Type = </w:t>
+        <w:t xml:space="preserve">.vercel.app</w:t>
+      </w:r>
+      <w:r>
+        <w:rPr>
+          <w:rFonts w:ascii="Calibri" w:cs="Calibri" w:eastAsia="Calibri" w:hAnsi="Calibri"/>
+        </w:rPr>
+        <w:t xml:space="preserve">). Login hanya berfungsi di alamat yang didaftarkan, jadi bagikan dan uji alamat utama (misalnya </w:t>
       </w:r>
       <w:r>
         <w:rPr>
@@ -4572,13 +4257,38 @@
           <w:sz w:val="20"/>
           <w:szCs w:val="20"/>
         </w:rPr>
-        <w:t xml:space="preserve">string</w:t>
-      </w:r>
-      <w:r>
-        <w:rPr>
-          <w:rFonts w:ascii="Calibri" w:cs="Calibri" w:eastAsia="Calibri" w:hAnsi="Calibri"/>
-        </w:rPr>
-        <w:t xml:space="preserve">, Value = nama guru (misalnya </w:t>
+        <w:t xml:space="preserve">kongruen-omega.vercel.app</w:t>
+      </w:r>
+      <w:r>
+        <w:rPr>
+          <w:rFonts w:ascii="Calibri" w:cs="Calibri" w:eastAsia="Calibri" w:hAnsi="Calibri"/>
+        </w:rPr>
+        <w:t xml:space="preserve">) kepada siswa.</w:t>
+      </w:r>
+    </w:p>
+    <w:p>
+      <w:pPr>
+        <w:spacing w:after="120"/>
+      </w:pPr>
+      <w:r>
+        <w:rPr>
+          <w:rFonts w:ascii="Calibri" w:cs="Calibri" w:eastAsia="Calibri" w:hAnsi="Calibri"/>
+        </w:rPr>
+        <w:t xml:space="preserve">4. Klik </w:t>
+      </w:r>
+      <w:r>
+        <w:rPr>
+          <w:rFonts w:ascii="Calibri" w:cs="Calibri" w:eastAsia="Calibri" w:hAnsi="Calibri"/>
+          <w:b/>
+          <w:bCs/>
+        </w:rPr>
+        <w:t xml:space="preserve">Add</w:t>
+      </w:r>
+      <w:r>
+        <w:rPr>
+          <w:rFonts w:ascii="Calibri" w:cs="Calibri" w:eastAsia="Calibri" w:hAnsi="Calibri"/>
+        </w:rPr>
+        <w:t xml:space="preserve">. Domain </w:t>
       </w:r>
       <w:r>
         <w:rPr>
@@ -4588,32 +4298,120 @@
           <w:sz w:val="20"/>
           <w:szCs w:val="20"/>
         </w:rPr>
-        <w:t xml:space="preserve">Bu Sari</w:t>
-      </w:r>
-      <w:r>
-        <w:rPr>
-          <w:rFonts w:ascii="Calibri" w:cs="Calibri" w:eastAsia="Calibri" w:hAnsi="Calibri"/>
-        </w:rPr>
-        <w:t xml:space="preserve">).</w:t>
-      </w:r>
-    </w:p>
-    <w:p>
-      <w:pPr>
-        <w:spacing w:after="120"/>
-      </w:pPr>
-      <w:r>
-        <w:rPr>
-          <w:rFonts w:ascii="Calibri" w:cs="Calibri" w:eastAsia="Calibri" w:hAnsi="Calibri"/>
-        </w:rPr>
-        <w:t xml:space="preserve">6. Klik </w:t>
-      </w:r>
-      <w:r>
-        <w:rPr>
-          <w:rFonts w:ascii="Calibri" w:cs="Calibri" w:eastAsia="Calibri" w:hAnsi="Calibri"/>
-          <w:b/>
-          <w:bCs/>
-        </w:rPr>
-        <w:t xml:space="preserve">Save</w:t>
+        <w:t xml:space="preserve">localhost</w:t>
+      </w:r>
+      <w:r>
+        <w:rPr>
+          <w:rFonts w:ascii="Calibri" w:cs="Calibri" w:eastAsia="Calibri" w:hAnsi="Calibri"/>
+        </w:rPr>
+        <w:t xml:space="preserve"> biasanya sudah ada secara bawaan untuk uji coba di komputer.</w:t>
+      </w:r>
+    </w:p>
+    <w:p>
+      <w:pPr>
+        <w:spacing w:after="120"/>
+      </w:pPr>
+      <w:r>
+        <w:rPr>
+          <w:rFonts w:ascii="Calibri" w:cs="Calibri" w:eastAsia="Calibri" w:hAnsi="Calibri"/>
+        </w:rPr>
+        <w:t xml:space="preserve">Jika langkah ini terlewat, siswa akan melihat pesan: "Domain website ini belum didaftarkan di Firebase".</w:t>
+      </w:r>
+    </w:p>
+    <w:p>
+      <w:pPr>
+        <w:pBdr>
+          <w:bottom w:val="single" w:color="CBD5E1" w:sz="6" w:space="1"/>
+        </w:pBdr>
+        <w:spacing w:after="120"/>
+      </w:pPr>
+    </w:p>
+    <w:p>
+      <w:pPr>
+        <w:pStyle w:val="Heading1"/>
+        <w:spacing w:after="140" w:before="320"/>
+      </w:pPr>
+      <w:r>
+        <w:rPr>
+          <w:rFonts w:ascii="Calibri" w:cs="Calibri" w:eastAsia="Calibri" w:hAnsi="Calibri"/>
+          <w:b/>
+          <w:bCs/>
+          <w:color w:val="17324D"/>
+          <w:sz w:val="30"/>
+          <w:szCs w:val="30"/>
+        </w:rPr>
+        <w:t xml:space="preserve">9. Membuat Akun Guru</w:t>
+      </w:r>
+    </w:p>
+    <w:p>
+      <w:pPr>
+        <w:spacing w:after="120"/>
+      </w:pPr>
+      <w:r>
+        <w:rPr>
+          <w:rFonts w:ascii="Calibri" w:cs="Calibri" w:eastAsia="Calibri" w:hAnsi="Calibri"/>
+        </w:rPr>
+        <w:t xml:space="preserve">Akun guru dibuat oleh admin (pemilik proyek Firebase), bukan dari website.</w:t>
+      </w:r>
+    </w:p>
+    <w:p>
+      <w:pPr>
+        <w:spacing w:after="120"/>
+      </w:pPr>
+      <w:r>
+        <w:rPr>
+          <w:rFonts w:ascii="Calibri" w:cs="Calibri" w:eastAsia="Calibri" w:hAnsi="Calibri"/>
+          <w:b/>
+          <w:bCs/>
+        </w:rPr>
+        <w:t xml:space="preserve">Langkah A: buat akun login guru</w:t>
+      </w:r>
+    </w:p>
+    <w:p>
+      <w:pPr>
+        <w:spacing w:after="120"/>
+      </w:pPr>
+      <w:r>
+        <w:rPr>
+          <w:rFonts w:ascii="Calibri" w:cs="Calibri" w:eastAsia="Calibri" w:hAnsi="Calibri"/>
+        </w:rPr>
+        <w:t xml:space="preserve">1. Buka </w:t>
+      </w:r>
+      <w:r>
+        <w:rPr>
+          <w:rFonts w:ascii="Calibri" w:cs="Calibri" w:eastAsia="Calibri" w:hAnsi="Calibri"/>
+          <w:b/>
+          <w:bCs/>
+        </w:rPr>
+        <w:t xml:space="preserve">Authentication</w:t>
+      </w:r>
+      <w:r>
+        <w:rPr>
+          <w:rFonts w:ascii="Calibri" w:cs="Calibri" w:eastAsia="Calibri" w:hAnsi="Calibri"/>
+        </w:rPr>
+        <w:t xml:space="preserve"> &gt; tab </w:t>
+      </w:r>
+      <w:r>
+        <w:rPr>
+          <w:rFonts w:ascii="Calibri" w:cs="Calibri" w:eastAsia="Calibri" w:hAnsi="Calibri"/>
+          <w:b/>
+          <w:bCs/>
+        </w:rPr>
+        <w:t xml:space="preserve">Users</w:t>
+      </w:r>
+      <w:r>
+        <w:rPr>
+          <w:rFonts w:ascii="Calibri" w:cs="Calibri" w:eastAsia="Calibri" w:hAnsi="Calibri"/>
+        </w:rPr>
+        <w:t xml:space="preserve"> &gt; </w:t>
+      </w:r>
+      <w:r>
+        <w:rPr>
+          <w:rFonts w:ascii="Calibri" w:cs="Calibri" w:eastAsia="Calibri" w:hAnsi="Calibri"/>
+          <w:b/>
+          <w:bCs/>
+        </w:rPr>
+        <w:t xml:space="preserve">Add user</w:t>
       </w:r>
       <w:r>
         <w:rPr>
@@ -4630,7 +4428,46 @@
         <w:rPr>
           <w:rFonts w:ascii="Calibri" w:cs="Calibri" w:eastAsia="Calibri" w:hAnsi="Calibri"/>
         </w:rPr>
-        <w:t xml:space="preserve">Untuk guru berikutnya, ulangi Langkah A, lalu di koleksi </w:t>
+        <w:t xml:space="preserve">2. Isi email guru dan kata sandi awal (minimal 6 karakter), lalu klik </w:t>
+      </w:r>
+      <w:r>
+        <w:rPr>
+          <w:rFonts w:ascii="Calibri" w:cs="Calibri" w:eastAsia="Calibri" w:hAnsi="Calibri"/>
+          <w:b/>
+          <w:bCs/>
+        </w:rPr>
+        <w:t xml:space="preserve">Add user</w:t>
+      </w:r>
+      <w:r>
+        <w:rPr>
+          <w:rFonts w:ascii="Calibri" w:cs="Calibri" w:eastAsia="Calibri" w:hAnsi="Calibri"/>
+        </w:rPr>
+        <w:t xml:space="preserve">.</w:t>
+      </w:r>
+    </w:p>
+    <w:p>
+      <w:pPr>
+        <w:spacing w:after="120"/>
+      </w:pPr>
+      <w:r>
+        <w:rPr>
+          <w:rFonts w:ascii="Calibri" w:cs="Calibri" w:eastAsia="Calibri" w:hAnsi="Calibri"/>
+        </w:rPr>
+        <w:t xml:space="preserve">3. Pada daftar pengguna, salin nilai kolom </w:t>
+      </w:r>
+      <w:r>
+        <w:rPr>
+          <w:rFonts w:ascii="Calibri" w:cs="Calibri" w:eastAsia="Calibri" w:hAnsi="Calibri"/>
+          <w:b/>
+          <w:bCs/>
+        </w:rPr>
+        <w:t xml:space="preserve">User UID</w:t>
+      </w:r>
+      <w:r>
+        <w:rPr>
+          <w:rFonts w:ascii="Calibri" w:cs="Calibri" w:eastAsia="Calibri" w:hAnsi="Calibri"/>
+        </w:rPr>
+        <w:t xml:space="preserve"> milik guru tersebut (deretan huruf dan angka, misalnya </w:t>
       </w:r>
       <w:r>
         <w:rPr>
@@ -4640,38 +4477,115 @@
           <w:sz w:val="20"/>
           <w:szCs w:val="20"/>
         </w:rPr>
-        <w:t xml:space="preserve">teachers</w:t>
-      </w:r>
-      <w:r>
-        <w:rPr>
-          <w:rFonts w:ascii="Calibri" w:cs="Calibri" w:eastAsia="Calibri" w:hAnsi="Calibri"/>
-        </w:rPr>
-        <w:t xml:space="preserve"> klik </w:t>
-      </w:r>
-      <w:r>
-        <w:rPr>
-          <w:rFonts w:ascii="Calibri" w:cs="Calibri" w:eastAsia="Calibri" w:hAnsi="Calibri"/>
-          <w:b/>
-          <w:bCs/>
-        </w:rPr>
-        <w:t xml:space="preserve">Add document</w:t>
-      </w:r>
-      <w:r>
-        <w:rPr>
-          <w:rFonts w:ascii="Calibri" w:cs="Calibri" w:eastAsia="Calibri" w:hAnsi="Calibri"/>
-        </w:rPr>
-        <w:t xml:space="preserve"> dengan Document ID = UID guru baru.</w:t>
-      </w:r>
-    </w:p>
-    <w:p>
-      <w:pPr>
-        <w:spacing w:after="120"/>
-      </w:pPr>
-      <w:r>
-        <w:rPr>
-          <w:rFonts w:ascii="Calibri" w:cs="Calibri" w:eastAsia="Calibri" w:hAnsi="Calibri"/>
-        </w:rPr>
-        <w:t xml:space="preserve">Untuk mencabut akses guru, hapus dokumen </w:t>
+        <w:t xml:space="preserve">PqFDxXkyi4U0TUQhJOEMr99DCPZE</w:t>
+      </w:r>
+      <w:r>
+        <w:rPr>
+          <w:rFonts w:ascii="Calibri" w:cs="Calibri" w:eastAsia="Calibri" w:hAnsi="Calibri"/>
+        </w:rPr>
+        <w:t xml:space="preserve">).</w:t>
+      </w:r>
+    </w:p>
+    <w:p>
+      <w:pPr>
+        <w:spacing w:after="120"/>
+      </w:pPr>
+      <w:r>
+        <w:rPr>
+          <w:rFonts w:ascii="Calibri" w:cs="Calibri" w:eastAsia="Calibri" w:hAnsi="Calibri"/>
+          <w:b/>
+          <w:bCs/>
+        </w:rPr>
+        <w:t xml:space="preserve">Langkah B: tandai akun sebagai guru</w:t>
+      </w:r>
+    </w:p>
+    <w:p>
+      <w:pPr>
+        <w:spacing w:after="120"/>
+      </w:pPr>
+      <w:r>
+        <w:rPr>
+          <w:rFonts w:ascii="Calibri" w:cs="Calibri" w:eastAsia="Calibri" w:hAnsi="Calibri"/>
+        </w:rPr>
+        <w:t xml:space="preserve">1. Buka </w:t>
+      </w:r>
+      <w:r>
+        <w:rPr>
+          <w:rFonts w:ascii="Calibri" w:cs="Calibri" w:eastAsia="Calibri" w:hAnsi="Calibri"/>
+          <w:b/>
+          <w:bCs/>
+        </w:rPr>
+        <w:t xml:space="preserve">Firestore Database</w:t>
+      </w:r>
+      <w:r>
+        <w:rPr>
+          <w:rFonts w:ascii="Calibri" w:cs="Calibri" w:eastAsia="Calibri" w:hAnsi="Calibri"/>
+        </w:rPr>
+        <w:t xml:space="preserve"> &gt; tab </w:t>
+      </w:r>
+      <w:r>
+        <w:rPr>
+          <w:rFonts w:ascii="Calibri" w:cs="Calibri" w:eastAsia="Calibri" w:hAnsi="Calibri"/>
+          <w:b/>
+          <w:bCs/>
+        </w:rPr>
+        <w:t xml:space="preserve">Data</w:t>
+      </w:r>
+      <w:r>
+        <w:rPr>
+          <w:rFonts w:ascii="Calibri" w:cs="Calibri" w:eastAsia="Calibri" w:hAnsi="Calibri"/>
+        </w:rPr>
+        <w:t xml:space="preserve">.</w:t>
+      </w:r>
+    </w:p>
+    <w:p>
+      <w:pPr>
+        <w:spacing w:after="120"/>
+      </w:pPr>
+      <w:r>
+        <w:rPr>
+          <w:rFonts w:ascii="Calibri" w:cs="Calibri" w:eastAsia="Calibri" w:hAnsi="Calibri"/>
+        </w:rPr>
+        <w:t xml:space="preserve">2. Klik </w:t>
+      </w:r>
+      <w:r>
+        <w:rPr>
+          <w:rFonts w:ascii="Calibri" w:cs="Calibri" w:eastAsia="Calibri" w:hAnsi="Calibri"/>
+          <w:b/>
+          <w:bCs/>
+        </w:rPr>
+        <w:t xml:space="preserve">Start collection</w:t>
+      </w:r>
+      <w:r>
+        <w:rPr>
+          <w:rFonts w:ascii="Calibri" w:cs="Calibri" w:eastAsia="Calibri" w:hAnsi="Calibri"/>
+        </w:rPr>
+        <w:t xml:space="preserve"> (atau </w:t>
+      </w:r>
+      <w:r>
+        <w:rPr>
+          <w:rFonts w:ascii="Calibri" w:cs="Calibri" w:eastAsia="Calibri" w:hAnsi="Calibri"/>
+          <w:b/>
+          <w:bCs/>
+        </w:rPr>
+        <w:t xml:space="preserve">+ Start collection</w:t>
+      </w:r>
+      <w:r>
+        <w:rPr>
+          <w:rFonts w:ascii="Calibri" w:cs="Calibri" w:eastAsia="Calibri" w:hAnsi="Calibri"/>
+        </w:rPr>
+        <w:t xml:space="preserve">).</w:t>
+      </w:r>
+    </w:p>
+    <w:p>
+      <w:pPr>
+        <w:spacing w:after="120"/>
+      </w:pPr>
+      <w:r>
+        <w:rPr>
+          <w:rFonts w:ascii="Calibri" w:cs="Calibri" w:eastAsia="Calibri" w:hAnsi="Calibri"/>
+        </w:rPr>
+        <w:t xml:space="preserve">3. Collection ID: ketik </w:t>
       </w:r>
       <w:r>
         <w:rPr>
@@ -4681,6 +4595,211 @@
           <w:sz w:val="20"/>
           <w:szCs w:val="20"/>
         </w:rPr>
+        <w:t xml:space="preserve">teachers</w:t>
+      </w:r>
+      <w:r>
+        <w:rPr>
+          <w:rFonts w:ascii="Calibri" w:cs="Calibri" w:eastAsia="Calibri" w:hAnsi="Calibri"/>
+        </w:rPr>
+        <w:t xml:space="preserve"> (huruf kecil semua, persis seperti ini). Klik </w:t>
+      </w:r>
+      <w:r>
+        <w:rPr>
+          <w:rFonts w:ascii="Calibri" w:cs="Calibri" w:eastAsia="Calibri" w:hAnsi="Calibri"/>
+          <w:b/>
+          <w:bCs/>
+        </w:rPr>
+        <w:t xml:space="preserve">Next</w:t>
+      </w:r>
+      <w:r>
+        <w:rPr>
+          <w:rFonts w:ascii="Calibri" w:cs="Calibri" w:eastAsia="Calibri" w:hAnsi="Calibri"/>
+        </w:rPr>
+        <w:t xml:space="preserve">.</w:t>
+      </w:r>
+    </w:p>
+    <w:p>
+      <w:pPr>
+        <w:spacing w:after="120"/>
+      </w:pPr>
+      <w:r>
+        <w:rPr>
+          <w:rFonts w:ascii="Calibri" w:cs="Calibri" w:eastAsia="Calibri" w:hAnsi="Calibri"/>
+        </w:rPr>
+        <w:t xml:space="preserve">4. Document ID: tempel </w:t>
+      </w:r>
+      <w:r>
+        <w:rPr>
+          <w:rFonts w:ascii="Calibri" w:cs="Calibri" w:eastAsia="Calibri" w:hAnsi="Calibri"/>
+          <w:b/>
+          <w:bCs/>
+        </w:rPr>
+        <w:t xml:space="preserve">User UID</w:t>
+      </w:r>
+      <w:r>
+        <w:rPr>
+          <w:rFonts w:ascii="Calibri" w:cs="Calibri" w:eastAsia="Calibri" w:hAnsi="Calibri"/>
+        </w:rPr>
+        <w:t xml:space="preserve"> guru dari Langkah A. Jangan klik </w:t>
+      </w:r>
+      <w:r>
+        <w:rPr>
+          <w:rFonts w:ascii="Calibri" w:cs="Calibri" w:eastAsia="Calibri" w:hAnsi="Calibri"/>
+          <w:b/>
+          <w:bCs/>
+        </w:rPr>
+        <w:t xml:space="preserve">Auto-ID</w:t>
+      </w:r>
+      <w:r>
+        <w:rPr>
+          <w:rFonts w:ascii="Calibri" w:cs="Calibri" w:eastAsia="Calibri" w:hAnsi="Calibri"/>
+        </w:rPr>
+        <w:t xml:space="preserve">.</w:t>
+      </w:r>
+    </w:p>
+    <w:p>
+      <w:pPr>
+        <w:spacing w:after="120"/>
+      </w:pPr>
+      <w:r>
+        <w:rPr>
+          <w:rFonts w:ascii="Calibri" w:cs="Calibri" w:eastAsia="Calibri" w:hAnsi="Calibri"/>
+        </w:rPr>
+        <w:t xml:space="preserve">5. Tambahkan field: Field = </w:t>
+      </w:r>
+      <w:r>
+        <w:rPr>
+          <w:rStyle w:val="InlineCode"/>
+          <w:rFonts w:ascii="Consolas" w:cs="Consolas" w:eastAsia="Consolas" w:hAnsi="Consolas"/>
+          <w:color w:val="334155"/>
+          <w:sz w:val="20"/>
+          <w:szCs w:val="20"/>
+        </w:rPr>
+        <w:t xml:space="preserve">name</w:t>
+      </w:r>
+      <w:r>
+        <w:rPr>
+          <w:rFonts w:ascii="Calibri" w:cs="Calibri" w:eastAsia="Calibri" w:hAnsi="Calibri"/>
+        </w:rPr>
+        <w:t xml:space="preserve">, Type = </w:t>
+      </w:r>
+      <w:r>
+        <w:rPr>
+          <w:rStyle w:val="InlineCode"/>
+          <w:rFonts w:ascii="Consolas" w:cs="Consolas" w:eastAsia="Consolas" w:hAnsi="Consolas"/>
+          <w:color w:val="334155"/>
+          <w:sz w:val="20"/>
+          <w:szCs w:val="20"/>
+        </w:rPr>
+        <w:t xml:space="preserve">string</w:t>
+      </w:r>
+      <w:r>
+        <w:rPr>
+          <w:rFonts w:ascii="Calibri" w:cs="Calibri" w:eastAsia="Calibri" w:hAnsi="Calibri"/>
+        </w:rPr>
+        <w:t xml:space="preserve">, Value = nama guru (misalnya </w:t>
+      </w:r>
+      <w:r>
+        <w:rPr>
+          <w:rStyle w:val="InlineCode"/>
+          <w:rFonts w:ascii="Consolas" w:cs="Consolas" w:eastAsia="Consolas" w:hAnsi="Consolas"/>
+          <w:color w:val="334155"/>
+          <w:sz w:val="20"/>
+          <w:szCs w:val="20"/>
+        </w:rPr>
+        <w:t xml:space="preserve">Bu Sari</w:t>
+      </w:r>
+      <w:r>
+        <w:rPr>
+          <w:rFonts w:ascii="Calibri" w:cs="Calibri" w:eastAsia="Calibri" w:hAnsi="Calibri"/>
+        </w:rPr>
+        <w:t xml:space="preserve">).</w:t>
+      </w:r>
+    </w:p>
+    <w:p>
+      <w:pPr>
+        <w:spacing w:after="120"/>
+      </w:pPr>
+      <w:r>
+        <w:rPr>
+          <w:rFonts w:ascii="Calibri" w:cs="Calibri" w:eastAsia="Calibri" w:hAnsi="Calibri"/>
+        </w:rPr>
+        <w:t xml:space="preserve">6. Klik </w:t>
+      </w:r>
+      <w:r>
+        <w:rPr>
+          <w:rFonts w:ascii="Calibri" w:cs="Calibri" w:eastAsia="Calibri" w:hAnsi="Calibri"/>
+          <w:b/>
+          <w:bCs/>
+        </w:rPr>
+        <w:t xml:space="preserve">Save</w:t>
+      </w:r>
+      <w:r>
+        <w:rPr>
+          <w:rFonts w:ascii="Calibri" w:cs="Calibri" w:eastAsia="Calibri" w:hAnsi="Calibri"/>
+        </w:rPr>
+        <w:t xml:space="preserve">.</w:t>
+      </w:r>
+    </w:p>
+    <w:p>
+      <w:pPr>
+        <w:spacing w:after="120"/>
+      </w:pPr>
+      <w:r>
+        <w:rPr>
+          <w:rFonts w:ascii="Calibri" w:cs="Calibri" w:eastAsia="Calibri" w:hAnsi="Calibri"/>
+        </w:rPr>
+        <w:t xml:space="preserve">Untuk guru berikutnya, ulangi Langkah A, lalu di koleksi </w:t>
+      </w:r>
+      <w:r>
+        <w:rPr>
+          <w:rStyle w:val="InlineCode"/>
+          <w:rFonts w:ascii="Consolas" w:cs="Consolas" w:eastAsia="Consolas" w:hAnsi="Consolas"/>
+          <w:color w:val="334155"/>
+          <w:sz w:val="20"/>
+          <w:szCs w:val="20"/>
+        </w:rPr>
+        <w:t xml:space="preserve">teachers</w:t>
+      </w:r>
+      <w:r>
+        <w:rPr>
+          <w:rFonts w:ascii="Calibri" w:cs="Calibri" w:eastAsia="Calibri" w:hAnsi="Calibri"/>
+        </w:rPr>
+        <w:t xml:space="preserve"> klik </w:t>
+      </w:r>
+      <w:r>
+        <w:rPr>
+          <w:rFonts w:ascii="Calibri" w:cs="Calibri" w:eastAsia="Calibri" w:hAnsi="Calibri"/>
+          <w:b/>
+          <w:bCs/>
+        </w:rPr>
+        <w:t xml:space="preserve">Add document</w:t>
+      </w:r>
+      <w:r>
+        <w:rPr>
+          <w:rFonts w:ascii="Calibri" w:cs="Calibri" w:eastAsia="Calibri" w:hAnsi="Calibri"/>
+        </w:rPr>
+        <w:t xml:space="preserve"> dengan Document ID = UID guru baru.</w:t>
+      </w:r>
+    </w:p>
+    <w:p>
+      <w:pPr>
+        <w:spacing w:after="120"/>
+      </w:pPr>
+      <w:r>
+        <w:rPr>
+          <w:rFonts w:ascii="Calibri" w:cs="Calibri" w:eastAsia="Calibri" w:hAnsi="Calibri"/>
+        </w:rPr>
+        <w:t xml:space="preserve">Untuk mencabut akses guru, hapus dokumen </w:t>
+      </w:r>
+      <w:r>
+        <w:rPr>
+          <w:rStyle w:val="InlineCode"/>
+          <w:rFonts w:ascii="Consolas" w:cs="Consolas" w:eastAsia="Consolas" w:hAnsi="Consolas"/>
+          <w:color w:val="334155"/>
+          <w:sz w:val="20"/>
+          <w:szCs w:val="20"/>
+        </w:rPr>
         <w:t xml:space="preserve">teachers/&lt;UID&gt;</w:t>
       </w:r>
       <w:r>
@@ -4723,7 +4842,7 @@
         <w:rPr>
           <w:rFonts w:ascii="Calibri" w:cs="Calibri" w:eastAsia="Calibri" w:hAnsi="Calibri"/>
         </w:rPr>
-        <w:t xml:space="preserve">Lakukan urutan berikut di situs Netlify:</w:t>
+        <w:t xml:space="preserve">Lakukan urutan berikut di situs yang sudah online (Netlify atau Vercel):</w:t>
       </w:r>
     </w:p>
     <w:p>
@@ -6131,9 +6250,9 @@
         <w:tblLayout w:type="fixed"/>
       </w:tblPr>
       <w:tblGrid>
-        <w:gridCol w:w="3212"/>
-        <w:gridCol w:w="2965"/>
-        <w:gridCol w:w="3461"/>
+        <w:gridCol w:w="3180"/>
+        <w:gridCol w:w="3033"/>
+        <w:gridCol w:w="3425"/>
       </w:tblGrid>
       <w:tr>
         <w:trPr>
@@ -6142,7 +6261,7 @@
         </w:trPr>
         <w:tc>
           <w:tcPr>
-            <w:tcW w:type="dxa" w:w="3212"/>
+            <w:tcW w:type="dxa" w:w="3180"/>
             <w:tcBorders>
               <w:top w:val="single" w:color="CBD5E1" w:sz="4"/>
               <w:left w:val="single" w:color="CBD5E1" w:sz="4"/>
@@ -6176,7 +6295,7 @@
         </w:tc>
         <w:tc>
           <w:tcPr>
-            <w:tcW w:type="dxa" w:w="2965"/>
+            <w:tcW w:type="dxa" w:w="3033"/>
             <w:tcBorders>
               <w:top w:val="single" w:color="CBD5E1" w:sz="4"/>
               <w:left w:val="single" w:color="CBD5E1" w:sz="4"/>
@@ -6210,7 +6329,7 @@
         </w:tc>
         <w:tc>
           <w:tcPr>
-            <w:tcW w:type="dxa" w:w="3461"/>
+            <w:tcW w:type="dxa" w:w="3425"/>
             <w:tcBorders>
               <w:top w:val="single" w:color="CBD5E1" w:sz="4"/>
               <w:left w:val="single" w:color="CBD5E1" w:sz="4"/>
@@ -6249,7 +6368,7 @@
         </w:trPr>
         <w:tc>
           <w:tcPr>
-            <w:tcW w:type="dxa" w:w="3212"/>
+            <w:tcW w:type="dxa" w:w="3180"/>
             <w:tcBorders>
               <w:top w:val="single" w:color="CBD5E1" w:sz="4"/>
               <w:left w:val="single" w:color="CBD5E1" w:sz="4"/>
@@ -6279,7 +6398,7 @@
         </w:tc>
         <w:tc>
           <w:tcPr>
-            <w:tcW w:type="dxa" w:w="2965"/>
+            <w:tcW w:type="dxa" w:w="3033"/>
             <w:tcBorders>
               <w:top w:val="single" w:color="CBD5E1" w:sz="4"/>
               <w:left w:val="single" w:color="CBD5E1" w:sz="4"/>
@@ -6319,7 +6438,7 @@
         </w:tc>
         <w:tc>
           <w:tcPr>
-            <w:tcW w:type="dxa" w:w="3461"/>
+            <w:tcW w:type="dxa" w:w="3425"/>
             <w:tcBorders>
               <w:top w:val="single" w:color="CBD5E1" w:sz="4"/>
               <w:left w:val="single" w:color="CBD5E1" w:sz="4"/>
@@ -6354,7 +6473,7 @@
         </w:trPr>
         <w:tc>
           <w:tcPr>
-            <w:tcW w:type="dxa" w:w="3212"/>
+            <w:tcW w:type="dxa" w:w="3180"/>
             <w:tcBorders>
               <w:top w:val="single" w:color="CBD5E1" w:sz="4"/>
               <w:left w:val="single" w:color="CBD5E1" w:sz="4"/>
@@ -6384,7 +6503,7 @@
         </w:tc>
         <w:tc>
           <w:tcPr>
-            <w:tcW w:type="dxa" w:w="2965"/>
+            <w:tcW w:type="dxa" w:w="3033"/>
             <w:tcBorders>
               <w:top w:val="single" w:color="CBD5E1" w:sz="4"/>
               <w:left w:val="single" w:color="CBD5E1" w:sz="4"/>
@@ -6414,7 +6533,7 @@
         </w:tc>
         <w:tc>
           <w:tcPr>
-            <w:tcW w:type="dxa" w:w="3461"/>
+            <w:tcW w:type="dxa" w:w="3425"/>
             <w:tcBorders>
               <w:top w:val="single" w:color="CBD5E1" w:sz="4"/>
               <w:left w:val="single" w:color="CBD5E1" w:sz="4"/>
@@ -6449,7 +6568,7 @@
         </w:trPr>
         <w:tc>
           <w:tcPr>
-            <w:tcW w:type="dxa" w:w="3212"/>
+            <w:tcW w:type="dxa" w:w="3180"/>
             <w:tcBorders>
               <w:top w:val="single" w:color="CBD5E1" w:sz="4"/>
               <w:left w:val="single" w:color="CBD5E1" w:sz="4"/>
@@ -6479,61 +6598,79 @@
         </w:tc>
         <w:tc>
           <w:tcPr>
-            <w:tcW w:type="dxa" w:w="2965"/>
-            <w:tcBorders>
-              <w:top w:val="single" w:color="CBD5E1" w:sz="4"/>
-              <w:left w:val="single" w:color="CBD5E1" w:sz="4"/>
-              <w:bottom w:val="single" w:color="CBD5E1" w:sz="4"/>
-              <w:right w:val="single" w:color="CBD5E1" w:sz="4"/>
-            </w:tcBorders>
-            <w:tcMar>
-              <w:top w:type="dxa" w:w="60"/>
-              <w:left w:type="dxa" w:w="100"/>
-              <w:bottom w:type="dxa" w:w="60"/>
-              <w:right w:type="dxa" w:w="100"/>
-            </w:tcMar>
-          </w:tcPr>
-          <w:p>
-            <w:pPr>
-              <w:spacing w:after="0" w:before="0"/>
-            </w:pPr>
-            <w:r>
-              <w:rPr>
-                <w:rFonts w:ascii="Calibri" w:cs="Calibri" w:eastAsia="Calibri" w:hAnsi="Calibri"/>
-                <w:sz w:val="19"/>
-                <w:szCs w:val="19"/>
-              </w:rPr>
-              <w:t xml:space="preserve">Langkah 8 terlewat</w:t>
-            </w:r>
-          </w:p>
-        </w:tc>
-        <w:tc>
-          <w:tcPr>
-            <w:tcW w:type="dxa" w:w="3461"/>
-            <w:tcBorders>
-              <w:top w:val="single" w:color="CBD5E1" w:sz="4"/>
-              <w:left w:val="single" w:color="CBD5E1" w:sz="4"/>
-              <w:bottom w:val="single" w:color="CBD5E1" w:sz="4"/>
-              <w:right w:val="single" w:color="CBD5E1" w:sz="4"/>
-            </w:tcBorders>
-            <w:tcMar>
-              <w:top w:type="dxa" w:w="60"/>
-              <w:left w:type="dxa" w:w="100"/>
-              <w:bottom w:type="dxa" w:w="60"/>
-              <w:right w:type="dxa" w:w="100"/>
-            </w:tcMar>
-          </w:tcPr>
-          <w:p>
-            <w:pPr>
-              <w:spacing w:after="0" w:before="0"/>
-            </w:pPr>
-            <w:r>
-              <w:rPr>
-                <w:rFonts w:ascii="Calibri" w:cs="Calibri" w:eastAsia="Calibri" w:hAnsi="Calibri"/>
-                <w:sz w:val="19"/>
-                <w:szCs w:val="19"/>
-              </w:rPr>
-              <w:t xml:space="preserve">Tambahkan domain Netlify ke Authorized domains</w:t>
+            <w:tcW w:type="dxa" w:w="3033"/>
+            <w:tcBorders>
+              <w:top w:val="single" w:color="CBD5E1" w:sz="4"/>
+              <w:left w:val="single" w:color="CBD5E1" w:sz="4"/>
+              <w:bottom w:val="single" w:color="CBD5E1" w:sz="4"/>
+              <w:right w:val="single" w:color="CBD5E1" w:sz="4"/>
+            </w:tcBorders>
+            <w:tcMar>
+              <w:top w:type="dxa" w:w="60"/>
+              <w:left w:type="dxa" w:w="100"/>
+              <w:bottom w:type="dxa" w:w="60"/>
+              <w:right w:type="dxa" w:w="100"/>
+            </w:tcMar>
+          </w:tcPr>
+          <w:p>
+            <w:pPr>
+              <w:spacing w:after="0" w:before="0"/>
+            </w:pPr>
+            <w:r>
+              <w:rPr>
+                <w:rFonts w:ascii="Calibri" w:cs="Calibri" w:eastAsia="Calibri" w:hAnsi="Calibri"/>
+                <w:sz w:val="19"/>
+                <w:szCs w:val="19"/>
+              </w:rPr>
+              <w:t xml:space="preserve">Langkah 8 terlewat, atau siswa membuka alamat pratinjau Vercel</w:t>
+            </w:r>
+          </w:p>
+        </w:tc>
+        <w:tc>
+          <w:tcPr>
+            <w:tcW w:type="dxa" w:w="3425"/>
+            <w:tcBorders>
+              <w:top w:val="single" w:color="CBD5E1" w:sz="4"/>
+              <w:left w:val="single" w:color="CBD5E1" w:sz="4"/>
+              <w:bottom w:val="single" w:color="CBD5E1" w:sz="4"/>
+              <w:right w:val="single" w:color="CBD5E1" w:sz="4"/>
+            </w:tcBorders>
+            <w:tcMar>
+              <w:top w:type="dxa" w:w="60"/>
+              <w:left w:type="dxa" w:w="100"/>
+              <w:bottom w:type="dxa" w:w="60"/>
+              <w:right w:type="dxa" w:w="100"/>
+            </w:tcMar>
+          </w:tcPr>
+          <w:p>
+            <w:pPr>
+              <w:spacing w:after="0" w:before="0"/>
+            </w:pPr>
+            <w:r>
+              <w:rPr>
+                <w:rFonts w:ascii="Calibri" w:cs="Calibri" w:eastAsia="Calibri" w:hAnsi="Calibri"/>
+                <w:sz w:val="19"/>
+                <w:szCs w:val="19"/>
+              </w:rPr>
+              <w:t xml:space="preserve">Tambahkan domain website (misalnya </w:t>
+            </w:r>
+            <w:r>
+              <w:rPr>
+                <w:rStyle w:val="InlineCode"/>
+                <w:rFonts w:ascii="Consolas" w:cs="Consolas" w:eastAsia="Consolas" w:hAnsi="Consolas"/>
+                <w:color w:val="334155"/>
+                <w:sz w:val="17"/>
+                <w:szCs w:val="17"/>
+              </w:rPr>
+              <w:t xml:space="preserve">kongruen-omega.vercel.app</w:t>
+            </w:r>
+            <w:r>
+              <w:rPr>
+                <w:rFonts w:ascii="Calibri" w:cs="Calibri" w:eastAsia="Calibri" w:hAnsi="Calibri"/>
+                <w:sz w:val="19"/>
+                <w:szCs w:val="19"/>
+              </w:rPr>
+              <w:t xml:space="preserve">) ke Authorized domains, dan pakai alamat utama</w:t>
             </w:r>
           </w:p>
         </w:tc>
@@ -6544,7 +6681,7 @@
         </w:trPr>
         <w:tc>
           <w:tcPr>
-            <w:tcW w:type="dxa" w:w="3212"/>
+            <w:tcW w:type="dxa" w:w="3180"/>
             <w:tcBorders>
               <w:top w:val="single" w:color="CBD5E1" w:sz="4"/>
               <w:left w:val="single" w:color="CBD5E1" w:sz="4"/>
@@ -6574,7 +6711,7 @@
         </w:tc>
         <w:tc>
           <w:tcPr>
-            <w:tcW w:type="dxa" w:w="2965"/>
+            <w:tcW w:type="dxa" w:w="3033"/>
             <w:tcBorders>
               <w:top w:val="single" w:color="CBD5E1" w:sz="4"/>
               <w:left w:val="single" w:color="CBD5E1" w:sz="4"/>
@@ -6604,7 +6741,7 @@
         </w:tc>
         <w:tc>
           <w:tcPr>
-            <w:tcW w:type="dxa" w:w="3461"/>
+            <w:tcW w:type="dxa" w:w="3425"/>
             <w:tcBorders>
               <w:top w:val="single" w:color="CBD5E1" w:sz="4"/>
               <w:left w:val="single" w:color="CBD5E1" w:sz="4"/>
@@ -6649,7 +6786,7 @@
         </w:trPr>
         <w:tc>
           <w:tcPr>
-            <w:tcW w:type="dxa" w:w="3212"/>
+            <w:tcW w:type="dxa" w:w="3180"/>
             <w:tcBorders>
               <w:top w:val="single" w:color="CBD5E1" w:sz="4"/>
               <w:left w:val="single" w:color="CBD5E1" w:sz="4"/>
@@ -6679,7 +6816,7 @@
         </w:tc>
         <w:tc>
           <w:tcPr>
-            <w:tcW w:type="dxa" w:w="2965"/>
+            <w:tcW w:type="dxa" w:w="3033"/>
             <w:tcBorders>
               <w:top w:val="single" w:color="CBD5E1" w:sz="4"/>
               <w:left w:val="single" w:color="CBD5E1" w:sz="4"/>
@@ -6727,7 +6864,7 @@
         </w:tc>
         <w:tc>
           <w:tcPr>
-            <w:tcW w:type="dxa" w:w="3461"/>
+            <w:tcW w:type="dxa" w:w="3425"/>
             <w:tcBorders>
               <w:top w:val="single" w:color="CBD5E1" w:sz="4"/>
               <w:left w:val="single" w:color="CBD5E1" w:sz="4"/>
@@ -6780,7 +6917,7 @@
         </w:trPr>
         <w:tc>
           <w:tcPr>
-            <w:tcW w:type="dxa" w:w="3212"/>
+            <w:tcW w:type="dxa" w:w="3180"/>
             <w:tcBorders>
               <w:top w:val="single" w:color="CBD5E1" w:sz="4"/>
               <w:left w:val="single" w:color="CBD5E1" w:sz="4"/>
@@ -6810,7 +6947,7 @@
         </w:tc>
         <w:tc>
           <w:tcPr>
-            <w:tcW w:type="dxa" w:w="2965"/>
+            <w:tcW w:type="dxa" w:w="3033"/>
             <w:tcBorders>
               <w:top w:val="single" w:color="CBD5E1" w:sz="4"/>
               <w:left w:val="single" w:color="CBD5E1" w:sz="4"/>
@@ -6840,7 +6977,7 @@
         </w:tc>
         <w:tc>
           <w:tcPr>
-            <w:tcW w:type="dxa" w:w="3461"/>
+            <w:tcW w:type="dxa" w:w="3425"/>
             <w:tcBorders>
               <w:top w:val="single" w:color="CBD5E1" w:sz="4"/>
               <w:left w:val="single" w:color="CBD5E1" w:sz="4"/>
@@ -6875,7 +7012,7 @@
         </w:trPr>
         <w:tc>
           <w:tcPr>
-            <w:tcW w:type="dxa" w:w="3212"/>
+            <w:tcW w:type="dxa" w:w="3180"/>
             <w:tcBorders>
               <w:top w:val="single" w:color="CBD5E1" w:sz="4"/>
               <w:left w:val="single" w:color="CBD5E1" w:sz="4"/>
@@ -6905,7 +7042,7 @@
         </w:tc>
         <w:tc>
           <w:tcPr>
-            <w:tcW w:type="dxa" w:w="2965"/>
+            <w:tcW w:type="dxa" w:w="3033"/>
             <w:tcBorders>
               <w:top w:val="single" w:color="CBD5E1" w:sz="4"/>
               <w:left w:val="single" w:color="CBD5E1" w:sz="4"/>
@@ -6935,7 +7072,7 @@
         </w:tc>
         <w:tc>
           <w:tcPr>
-            <w:tcW w:type="dxa" w:w="3461"/>
+            <w:tcW w:type="dxa" w:w="3425"/>
             <w:tcBorders>
               <w:top w:val="single" w:color="CBD5E1" w:sz="4"/>
               <w:left w:val="single" w:color="CBD5E1" w:sz="4"/>
@@ -6970,7 +7107,7 @@
         </w:trPr>
         <w:tc>
           <w:tcPr>
-            <w:tcW w:type="dxa" w:w="3212"/>
+            <w:tcW w:type="dxa" w:w="3180"/>
             <w:tcBorders>
               <w:top w:val="single" w:color="CBD5E1" w:sz="4"/>
               <w:left w:val="single" w:color="CBD5E1" w:sz="4"/>
@@ -7000,7 +7137,7 @@
         </w:tc>
         <w:tc>
           <w:tcPr>
-            <w:tcW w:type="dxa" w:w="2965"/>
+            <w:tcW w:type="dxa" w:w="3033"/>
             <w:tcBorders>
               <w:top w:val="single" w:color="CBD5E1" w:sz="4"/>
               <w:left w:val="single" w:color="CBD5E1" w:sz="4"/>
@@ -7030,7 +7167,7 @@
         </w:tc>
         <w:tc>
           <w:tcPr>
-            <w:tcW w:type="dxa" w:w="3461"/>
+            <w:tcW w:type="dxa" w:w="3425"/>
             <w:tcBorders>
               <w:top w:val="single" w:color="CBD5E1" w:sz="4"/>
               <w:left w:val="single" w:color="CBD5E1" w:sz="4"/>
@@ -7065,7 +7202,7 @@
         </w:trPr>
         <w:tc>
           <w:tcPr>
-            <w:tcW w:type="dxa" w:w="3212"/>
+            <w:tcW w:type="dxa" w:w="3180"/>
             <w:tcBorders>
               <w:top w:val="single" w:color="CBD5E1" w:sz="4"/>
               <w:left w:val="single" w:color="CBD5E1" w:sz="4"/>
@@ -7095,7 +7232,7 @@
         </w:tc>
         <w:tc>
           <w:tcPr>
-            <w:tcW w:type="dxa" w:w="2965"/>
+            <w:tcW w:type="dxa" w:w="3033"/>
             <w:tcBorders>
               <w:top w:val="single" w:color="CBD5E1" w:sz="4"/>
               <w:left w:val="single" w:color="CBD5E1" w:sz="4"/>
@@ -7125,7 +7262,7 @@
         </w:tc>
         <w:tc>
           <w:tcPr>
-            <w:tcW w:type="dxa" w:w="3461"/>
+            <w:tcW w:type="dxa" w:w="3425"/>
             <w:tcBorders>
               <w:top w:val="single" w:color="CBD5E1" w:sz="4"/>
               <w:left w:val="single" w:color="CBD5E1" w:sz="4"/>
@@ -7160,7 +7297,7 @@
         </w:trPr>
         <w:tc>
           <w:tcPr>
-            <w:tcW w:type="dxa" w:w="3212"/>
+            <w:tcW w:type="dxa" w:w="3180"/>
             <w:tcBorders>
               <w:top w:val="single" w:color="CBD5E1" w:sz="4"/>
               <w:left w:val="single" w:color="CBD5E1" w:sz="4"/>
@@ -7190,7 +7327,7 @@
         </w:tc>
         <w:tc>
           <w:tcPr>
-            <w:tcW w:type="dxa" w:w="2965"/>
+            <w:tcW w:type="dxa" w:w="3033"/>
             <w:tcBorders>
               <w:top w:val="single" w:color="CBD5E1" w:sz="4"/>
               <w:left w:val="single" w:color="CBD5E1" w:sz="4"/>
@@ -7220,7 +7357,7 @@
         </w:tc>
         <w:tc>
           <w:tcPr>
-            <w:tcW w:type="dxa" w:w="3461"/>
+            <w:tcW w:type="dxa" w:w="3425"/>
             <w:tcBorders>
               <w:top w:val="single" w:color="CBD5E1" w:sz="4"/>
               <w:left w:val="single" w:color="CBD5E1" w:sz="4"/>

</xml_diff>

<commit_message>
Rapikan urutan langkah domain di tutorial Firebase
Co-Authored-By: Claude Opus 5.5 <noreply@anthropic.com>
Claude-Session: https://claude.ai/code/session_0129ryr42iuGGCdByrSF5R7U
</commit_message>
<xml_diff>
--- a/docs/Tutorial_Login_Firebase_GeoMatch.docx
+++ b/docs/Tutorial_Login_Firebase_GeoMatch.docx
@@ -4231,7 +4231,21 @@
         <w:rPr>
           <w:rFonts w:ascii="Calibri" w:cs="Calibri" w:eastAsia="Calibri" w:hAnsi="Calibri"/>
         </w:rPr>
-        <w:t xml:space="preserve">5. Khusus Vercel: setiap deployment juga punya alamat pratinjau yang berbeda (berakhiran </w:t>
+        <w:t xml:space="preserve">4. Klik </w:t>
+      </w:r>
+      <w:r>
+        <w:rPr>
+          <w:rFonts w:ascii="Calibri" w:cs="Calibri" w:eastAsia="Calibri" w:hAnsi="Calibri"/>
+          <w:b/>
+          <w:bCs/>
+        </w:rPr>
+        <w:t xml:space="preserve">Add</w:t>
+      </w:r>
+      <w:r>
+        <w:rPr>
+          <w:rFonts w:ascii="Calibri" w:cs="Calibri" w:eastAsia="Calibri" w:hAnsi="Calibri"/>
+        </w:rPr>
+        <w:t xml:space="preserve">. Domain </w:t>
       </w:r>
       <w:r>
         <w:rPr>
@@ -4241,13 +4255,24 @@
           <w:sz w:val="20"/>
           <w:szCs w:val="20"/>
         </w:rPr>
-        <w:t xml:space="preserve">.vercel.app</w:t>
-      </w:r>
-      <w:r>
-        <w:rPr>
-          <w:rFonts w:ascii="Calibri" w:cs="Calibri" w:eastAsia="Calibri" w:hAnsi="Calibri"/>
-        </w:rPr>
-        <w:t xml:space="preserve">). Login hanya berfungsi di alamat yang didaftarkan, jadi bagikan dan uji alamat utama (misalnya </w:t>
+        <w:t xml:space="preserve">localhost</w:t>
+      </w:r>
+      <w:r>
+        <w:rPr>
+          <w:rFonts w:ascii="Calibri" w:cs="Calibri" w:eastAsia="Calibri" w:hAnsi="Calibri"/>
+        </w:rPr>
+        <w:t xml:space="preserve"> biasanya sudah ada secara bawaan untuk uji coba di komputer.</w:t>
+      </w:r>
+    </w:p>
+    <w:p>
+      <w:pPr>
+        <w:spacing w:after="120"/>
+      </w:pPr>
+      <w:r>
+        <w:rPr>
+          <w:rFonts w:ascii="Calibri" w:cs="Calibri" w:eastAsia="Calibri" w:hAnsi="Calibri"/>
+        </w:rPr>
+        <w:t xml:space="preserve">5. Khusus Vercel: setiap deployment juga punya alamat pratinjau yang berbeda (berakhiran </w:t>
       </w:r>
       <w:r>
         <w:rPr>
@@ -4257,38 +4282,13 @@
           <w:sz w:val="20"/>
           <w:szCs w:val="20"/>
         </w:rPr>
-        <w:t xml:space="preserve">kongruen-omega.vercel.app</w:t>
-      </w:r>
-      <w:r>
-        <w:rPr>
-          <w:rFonts w:ascii="Calibri" w:cs="Calibri" w:eastAsia="Calibri" w:hAnsi="Calibri"/>
-        </w:rPr>
-        <w:t xml:space="preserve">) kepada siswa.</w:t>
-      </w:r>
-    </w:p>
-    <w:p>
-      <w:pPr>
-        <w:spacing w:after="120"/>
-      </w:pPr>
-      <w:r>
-        <w:rPr>
-          <w:rFonts w:ascii="Calibri" w:cs="Calibri" w:eastAsia="Calibri" w:hAnsi="Calibri"/>
-        </w:rPr>
-        <w:t xml:space="preserve">4. Klik </w:t>
-      </w:r>
-      <w:r>
-        <w:rPr>
-          <w:rFonts w:ascii="Calibri" w:cs="Calibri" w:eastAsia="Calibri" w:hAnsi="Calibri"/>
-          <w:b/>
-          <w:bCs/>
-        </w:rPr>
-        <w:t xml:space="preserve">Add</w:t>
-      </w:r>
-      <w:r>
-        <w:rPr>
-          <w:rFonts w:ascii="Calibri" w:cs="Calibri" w:eastAsia="Calibri" w:hAnsi="Calibri"/>
-        </w:rPr>
-        <w:t xml:space="preserve">. Domain </w:t>
+        <w:t xml:space="preserve">.vercel.app</w:t>
+      </w:r>
+      <w:r>
+        <w:rPr>
+          <w:rFonts w:ascii="Calibri" w:cs="Calibri" w:eastAsia="Calibri" w:hAnsi="Calibri"/>
+        </w:rPr>
+        <w:t xml:space="preserve">). Login hanya berfungsi di alamat yang didaftarkan, jadi bagikan dan uji alamat utama (misalnya </w:t>
       </w:r>
       <w:r>
         <w:rPr>
@@ -4298,13 +4298,13 @@
           <w:sz w:val="20"/>
           <w:szCs w:val="20"/>
         </w:rPr>
-        <w:t xml:space="preserve">localhost</w:t>
-      </w:r>
-      <w:r>
-        <w:rPr>
-          <w:rFonts w:ascii="Calibri" w:cs="Calibri" w:eastAsia="Calibri" w:hAnsi="Calibri"/>
-        </w:rPr>
-        <w:t xml:space="preserve"> biasanya sudah ada secara bawaan untuk uji coba di komputer.</w:t>
+        <w:t xml:space="preserve">kongruen-omega.vercel.app</w:t>
+      </w:r>
+      <w:r>
+        <w:rPr>
+          <w:rFonts w:ascii="Calibri" w:cs="Calibri" w:eastAsia="Calibri" w:hAnsi="Calibri"/>
+        </w:rPr>
+        <w:t xml:space="preserve">) kepada siswa.</w:t>
       </w:r>
     </w:p>
     <w:p>

</xml_diff>